<commit_message>
Finalize proposal to 3 pages and clean up legacy script/figure outputs
- Proposal: add per-class train/val/test breakdown table, tighten
  spacing and figure sizes so the document is exactly 3 pages
- Remove superseded dark-theme figures and the one-off docx figure
  generator script; trim script docstrings
</commit_message>
<xml_diff>
--- a/proposal/EuroSAT_Proposal.docx
+++ b/proposal/EuroSAT_Proposal.docx
@@ -4,7 +4,7 @@
   <w:body>
     <w:p>
       <w:pPr>
-        <w:spacing w:after="140"/>
+        <w:spacing w:after="110"/>
         <w:jc w:val="center"/>
       </w:pPr>
       <w:r>
@@ -19,7 +19,7 @@
     </w:p>
     <w:p>
       <w:pPr>
-        <w:spacing w:after="200"/>
+        <w:spacing w:after="110"/>
         <w:jc w:val="center"/>
       </w:pPr>
       <w:r>
@@ -28,7 +28,7 @@
     </w:p>
     <w:p>
       <w:pPr>
-        <w:spacing w:after="420"/>
+        <w:spacing w:after="260"/>
         <w:jc w:val="center"/>
       </w:pPr>
       <w:r>
@@ -38,7 +38,7 @@
     <w:p>
       <w:pPr>
         <w:pStyle w:val="Heading1"/>
-        <w:spacing w:after="150"/>
+        <w:spacing w:after="110"/>
         <w:jc w:val="both"/>
       </w:pPr>
       <w:r>
@@ -54,7 +54,7 @@
     </w:p>
     <w:p>
       <w:pPr>
-        <w:spacing w:after="170" w:line="276" w:lineRule="auto"/>
+        <w:spacing w:after="120" w:line="236" w:lineRule="auto"/>
         <w:ind w:left="340" w:hanging="340"/>
         <w:jc w:val="both"/>
       </w:pPr>
@@ -71,7 +71,7 @@
     </w:p>
     <w:p>
       <w:pPr>
-        <w:spacing w:after="170" w:line="276" w:lineRule="auto"/>
+        <w:spacing w:after="120" w:line="236" w:lineRule="auto"/>
         <w:ind w:left="340" w:hanging="340"/>
         <w:jc w:val="both"/>
       </w:pPr>
@@ -88,7 +88,7 @@
     </w:p>
     <w:p>
       <w:pPr>
-        <w:spacing w:after="170" w:line="276" w:lineRule="auto"/>
+        <w:spacing w:after="120" w:line="236" w:lineRule="auto"/>
         <w:ind w:left="340" w:hanging="340"/>
         <w:jc w:val="both"/>
       </w:pPr>
@@ -105,7 +105,7 @@
     </w:p>
     <w:p>
       <w:pPr>
-        <w:spacing w:after="170" w:line="276" w:lineRule="auto"/>
+        <w:spacing w:after="120" w:line="236" w:lineRule="auto"/>
         <w:ind w:left="340" w:hanging="340"/>
         <w:jc w:val="both"/>
       </w:pPr>
@@ -122,7 +122,7 @@
     </w:p>
     <w:p>
       <w:pPr>
-        <w:spacing w:after="170" w:line="276" w:lineRule="auto"/>
+        <w:spacing w:after="120" w:line="236" w:lineRule="auto"/>
         <w:ind w:left="340" w:hanging="340"/>
         <w:jc w:val="both"/>
       </w:pPr>
@@ -140,7 +140,7 @@
     <w:p>
       <w:pPr>
         <w:pStyle w:val="Heading1"/>
-        <w:spacing w:before="320" w:after="150"/>
+        <w:spacing w:before="220" w:after="110"/>
         <w:jc w:val="both"/>
       </w:pPr>
       <w:r>
@@ -156,7 +156,7 @@
     </w:p>
     <w:p>
       <w:pPr>
-        <w:spacing w:after="170" w:line="276" w:lineRule="auto"/>
+        <w:spacing w:after="120" w:line="236" w:lineRule="auto"/>
         <w:ind w:left="340" w:hanging="340"/>
         <w:jc w:val="both"/>
       </w:pPr>
@@ -173,7 +173,7 @@
     </w:p>
     <w:p>
       <w:pPr>
-        <w:spacing w:after="170" w:line="276" w:lineRule="auto"/>
+        <w:spacing w:after="120" w:line="236" w:lineRule="auto"/>
         <w:ind w:left="340" w:hanging="340"/>
         <w:jc w:val="both"/>
       </w:pPr>
@@ -190,7 +190,7 @@
     </w:p>
     <w:p>
       <w:pPr>
-        <w:spacing w:after="170" w:line="276" w:lineRule="auto"/>
+        <w:spacing w:after="120" w:line="236" w:lineRule="auto"/>
         <w:ind w:left="340" w:hanging="340"/>
         <w:jc w:val="both"/>
         <w:rPr>
@@ -210,41 +210,7 @@
     </w:p>
     <w:p>
       <w:pPr>
-        <w:spacing w:after="170" w:line="276" w:lineRule="auto"/>
-        <w:ind w:left="340" w:hanging="340"/>
-        <w:jc w:val="both"/>
-      </w:pPr>
-    </w:p>
-    <w:p>
-      <w:pPr>
-        <w:spacing w:after="170" w:line="276" w:lineRule="auto"/>
-        <w:ind w:left="340" w:hanging="340"/>
-        <w:jc w:val="both"/>
-        <w:rPr>
-          <w:rtl/>
-        </w:rPr>
-      </w:pPr>
-    </w:p>
-    <w:p>
-      <w:pPr>
-        <w:spacing w:after="170" w:line="276" w:lineRule="auto"/>
-        <w:ind w:left="340" w:hanging="340"/>
-        <w:jc w:val="both"/>
-        <w:rPr>
-          <w:rtl/>
-        </w:rPr>
-      </w:pPr>
-    </w:p>
-    <w:p>
-      <w:pPr>
-        <w:spacing w:after="170" w:line="276" w:lineRule="auto"/>
-        <w:ind w:left="340" w:hanging="340"/>
-        <w:jc w:val="both"/>
-      </w:pPr>
-    </w:p>
-    <w:p>
-      <w:pPr>
-        <w:spacing w:after="280" w:line="276" w:lineRule="auto"/>
+        <w:spacing w:after="200" w:line="236" w:lineRule="auto"/>
         <w:ind w:left="340" w:hanging="340"/>
         <w:jc w:val="both"/>
       </w:pPr>
@@ -1082,7 +1048,7 @@
     </w:tbl>
     <w:p>
       <w:pPr>
-        <w:spacing w:before="110" w:after="280"/>
+        <w:spacing w:before="80" w:after="180"/>
         <w:ind w:firstLine="340"/>
         <w:jc w:val="both"/>
       </w:pPr>
@@ -1098,7 +1064,7 @@
     </w:p>
     <w:p>
       <w:pPr>
-        <w:spacing w:after="170" w:line="276" w:lineRule="auto"/>
+        <w:spacing w:after="120" w:line="236" w:lineRule="auto"/>
         <w:ind w:left="340" w:hanging="340"/>
         <w:jc w:val="both"/>
       </w:pPr>
@@ -1115,7 +1081,7 @@
     </w:p>
     <w:p>
       <w:pPr>
-        <w:spacing w:after="280" w:line="276" w:lineRule="auto"/>
+        <w:spacing w:after="200" w:line="236" w:lineRule="auto"/>
         <w:ind w:left="340" w:hanging="340"/>
         <w:jc w:val="both"/>
       </w:pPr>
@@ -1174,25 +1140,19 @@
           </w:tcPr>
           <w:p>
             <w:pPr>
-              <w:spacing w:line="276" w:lineRule="auto"/>
+              <w:spacing w:line="236" w:lineRule="auto"/>
               <w:jc w:val="both"/>
             </w:pPr>
           </w:p>
           <w:p>
             <w:pPr>
-              <w:spacing w:line="276" w:lineRule="auto"/>
+              <w:spacing w:line="236" w:lineRule="auto"/>
               <w:jc w:val="both"/>
             </w:pPr>
           </w:p>
           <w:p>
             <w:pPr>
-              <w:spacing w:line="276" w:lineRule="auto"/>
-              <w:jc w:val="both"/>
-            </w:pPr>
-          </w:p>
-          <w:p>
-            <w:pPr>
-              <w:spacing w:line="276" w:lineRule="auto"/>
+              <w:spacing w:line="236" w:lineRule="auto"/>
               <w:jc w:val="both"/>
             </w:pPr>
             <w:r>
@@ -1201,7 +1161,7 @@
               </w:rPr>
               <w:drawing>
                 <wp:inline xmlns:wp="http://schemas.openxmlformats.org/drawingml/2006/wordprocessingDrawing" distT="0" distB="0" distL="0" distR="0">
-                  <wp:extent cx="5715000" cy="2577503"/>
+                  <wp:extent cx="4846320" cy="2185723"/>
                   <wp:effectExtent l="0" t="0" r="0" b="0"/>
                   <wp:docPr id="101" name="Figure1_SampleGrid"/>
                   <wp:cNvGraphicFramePr>
@@ -1223,7 +1183,7 @@
                         <pic:spPr>
                           <a:xfrm>
                             <a:off x="0" y="0"/>
-                            <a:ext cx="5715000" cy="2577503"/>
+                            <a:ext cx="4846320" cy="2185723"/>
                           </a:xfrm>
                           <a:prstGeom prst="rect">
                             <a:avLst/>
@@ -1236,30 +1196,12 @@
               </w:drawing>
             </w:r>
           </w:p>
-          <w:p>
-            <w:pPr>
-              <w:spacing w:line="276" w:lineRule="auto"/>
-              <w:jc w:val="both"/>
-            </w:pPr>
-          </w:p>
-          <w:p>
-            <w:pPr>
-              <w:spacing w:line="276" w:lineRule="auto"/>
-              <w:jc w:val="both"/>
-            </w:pPr>
-          </w:p>
-          <w:p>
-            <w:pPr>
-              <w:spacing w:line="276" w:lineRule="auto"/>
-              <w:jc w:val="both"/>
-            </w:pPr>
-          </w:p>
         </w:tc>
       </w:tr>
     </w:tbl>
     <w:p>
       <w:pPr>
-        <w:spacing w:before="110" w:after="300"/>
+        <w:spacing w:before="80" w:after="200"/>
         <w:jc w:val="both"/>
       </w:pPr>
       <w:r>
@@ -1327,25 +1269,19 @@
           </w:tcPr>
           <w:p>
             <w:pPr>
-              <w:spacing w:line="276" w:lineRule="auto"/>
+              <w:spacing w:line="236" w:lineRule="auto"/>
               <w:jc w:val="both"/>
             </w:pPr>
           </w:p>
           <w:p>
             <w:pPr>
-              <w:spacing w:line="276" w:lineRule="auto"/>
+              <w:spacing w:line="236" w:lineRule="auto"/>
               <w:jc w:val="both"/>
             </w:pPr>
           </w:p>
           <w:p>
             <w:pPr>
-              <w:spacing w:line="276" w:lineRule="auto"/>
-              <w:jc w:val="both"/>
-            </w:pPr>
-          </w:p>
-          <w:p>
-            <w:pPr>
-              <w:spacing w:line="276" w:lineRule="auto"/>
+              <w:spacing w:line="236" w:lineRule="auto"/>
               <w:jc w:val="both"/>
             </w:pPr>
             <w:r>
@@ -1354,7 +1290,7 @@
               </w:rPr>
               <w:drawing>
                 <wp:inline xmlns:wp="http://schemas.openxmlformats.org/drawingml/2006/wordprocessingDrawing" distT="0" distB="0" distL="0" distR="0">
-                  <wp:extent cx="5715000" cy="2414016"/>
+                  <wp:extent cx="4846320" cy="2047086"/>
                   <wp:effectExtent l="0" t="0" r="0" b="0"/>
                   <wp:docPr id="102" name="Figure2_CountsIntensity"/>
                   <wp:cNvGraphicFramePr>
@@ -1376,7 +1312,7 @@
                         <pic:spPr>
                           <a:xfrm>
                             <a:off x="0" y="0"/>
-                            <a:ext cx="5715000" cy="2414016"/>
+                            <a:ext cx="4846320" cy="2047086"/>
                           </a:xfrm>
                           <a:prstGeom prst="rect">
                             <a:avLst/>
@@ -1389,30 +1325,12 @@
               </w:drawing>
             </w:r>
           </w:p>
-          <w:p>
-            <w:pPr>
-              <w:spacing w:line="276" w:lineRule="auto"/>
-              <w:jc w:val="both"/>
-            </w:pPr>
-          </w:p>
-          <w:p>
-            <w:pPr>
-              <w:spacing w:line="276" w:lineRule="auto"/>
-              <w:jc w:val="both"/>
-            </w:pPr>
-          </w:p>
-          <w:p>
-            <w:pPr>
-              <w:spacing w:line="276" w:lineRule="auto"/>
-              <w:jc w:val="both"/>
-            </w:pPr>
-          </w:p>
         </w:tc>
       </w:tr>
     </w:tbl>
     <w:p>
       <w:pPr>
-        <w:spacing w:before="110" w:after="300"/>
+        <w:spacing w:before="80" w:after="200"/>
         <w:jc w:val="both"/>
       </w:pPr>
       <w:r>
@@ -1438,7 +1356,7 @@
     </w:p>
     <w:p>
       <w:pPr>
-        <w:spacing w:after="170" w:line="276" w:lineRule="auto"/>
+        <w:spacing w:after="120" w:line="236" w:lineRule="auto"/>
         <w:jc w:val="both"/>
       </w:pPr>
       <w:r>
@@ -1449,7 +1367,7 @@
     <w:p>
       <w:pPr>
         <w:pStyle w:val="Heading1"/>
-        <w:spacing w:before="320" w:after="150"/>
+        <w:spacing w:before="220" w:after="110"/>
         <w:jc w:val="both"/>
       </w:pPr>
       <w:r>
@@ -1465,7 +1383,7 @@
     </w:p>
     <w:p>
       <w:pPr>
-        <w:spacing w:after="280" w:line="276" w:lineRule="auto"/>
+        <w:spacing w:after="200" w:line="236" w:lineRule="auto"/>
         <w:ind w:left="340" w:hanging="340"/>
         <w:jc w:val="both"/>
       </w:pPr>
@@ -2040,7 +1958,7 @@
     </w:tbl>
     <w:p>
       <w:pPr>
-        <w:spacing w:before="110" w:after="280"/>
+        <w:spacing w:before="80" w:after="180"/>
         <w:jc w:val="both"/>
       </w:pPr>
       <w:r>
@@ -2055,7 +1973,7 @@
     </w:p>
     <w:p>
       <w:pPr>
-        <w:spacing w:after="170" w:line="276" w:lineRule="auto"/>
+        <w:spacing w:after="120" w:line="236" w:lineRule="auto"/>
         <w:jc w:val="both"/>
       </w:pPr>
       <w:r>
@@ -2064,8 +1982,2011 @@
     </w:p>
     <w:p>
       <w:pPr>
+        <w:spacing w:after="120" w:line="236" w:lineRule="auto"/>
+        <w:jc w:val="both"/>
+      </w:pPr>
+      <w:r>
+        <w:t>The table below confirms this class-by-class: every one of the ten classes is split at exactly 70% train, 15% validation and 15% test, so no class is over- or under-represented in any split.</w:t>
+      </w:r>
+    </w:p>
+    <w:tbl>
+      <w:tblPr>
+        <w:tblW w:w="8200" w:type="dxa"/>
+        <w:jc w:val="center"/>
+        <w:tblBorders>
+          <w:top w:val="none" w:sz="0" w:space="0" w:color="FFFFFF"/>
+          <w:left w:val="none" w:sz="0" w:space="0" w:color="FFFFFF"/>
+          <w:bottom w:val="none" w:sz="0" w:space="0" w:color="FFFFFF"/>
+          <w:right w:val="none" w:sz="0" w:space="0" w:color="FFFFFF"/>
+          <w:insideH w:val="none" w:sz="0" w:space="0" w:color="FFFFFF"/>
+          <w:insideV w:val="none" w:sz="0" w:space="0" w:color="FFFFFF"/>
+        </w:tblBorders>
+        <w:tblCellMar>
+          <w:left w:w="10" w:type="dxa"/>
+          <w:right w:w="10" w:type="dxa"/>
+        </w:tblCellMar>
+        <w:tblLook w:val="04A0" w:firstRow="1" w:lastRow="0" w:firstColumn="1" w:lastColumn="0" w:noHBand="0" w:noVBand="1"/>
+      </w:tblPr>
+      <w:tblGrid>
+        <w:gridCol w:w="2200"/>
+        <w:gridCol w:w="1500"/>
+        <w:gridCol w:w="1500"/>
+        <w:gridCol w:w="1500"/>
+        <w:gridCol w:w="1500"/>
+      </w:tblGrid>
+      <w:tr>
+        <w:tblPrEx>
+          <w:tblCellMar>
+            <w:top w:w="0" w:type="dxa"/>
+            <w:bottom w:w="0" w:type="dxa"/>
+          </w:tblCellMar>
+        </w:tblPrEx>
+        <w:trPr>
+          <w:cantSplit/>
+          <w:tblHeader/>
+          <w:jc w:val="center"/>
+        </w:trPr>
+        <w:tc>
+          <w:tcPr>
+            <w:tcW w:w="2200" w:type="dxa"/>
+            <w:tcBorders>
+              <w:top w:val="single" w:sz="4" w:space="0" w:color="000000"/>
+              <w:left w:val="none" w:sz="0" w:space="0" w:color="FFFFFF"/>
+              <w:bottom w:val="single" w:sz="4" w:space="0" w:color="000000"/>
+              <w:right w:val="none" w:sz="0" w:space="0" w:color="FFFFFF"/>
+            </w:tcBorders>
+            <w:tcMar>
+              <w:top w:w="30" w:type="dxa"/>
+              <w:left w:w="0" w:type="dxa"/>
+              <w:bottom w:w="30" w:type="dxa"/>
+              <w:right w:w="120" w:type="dxa"/>
+            </w:tcMar>
+          </w:tcPr>
+          <w:p>
+            <w:pPr>
+              <w:spacing w:line="236" w:lineRule="auto"/>
+            </w:pPr>
+            <w:r>
+              <w:rPr>
+                <w:b/>
+                <w:bCs/>
+                <w:sz w:val="20"/>
+                <w:szCs w:val="20"/>
+              </w:rPr>
+              <w:t>Class</w:t>
+            </w:r>
+          </w:p>
+        </w:tc>
+        <w:tc>
+          <w:tcPr>
+            <w:tcW w:w="1500" w:type="dxa"/>
+            <w:tcBorders>
+              <w:top w:val="single" w:sz="4" w:space="0" w:color="000000"/>
+              <w:left w:val="none" w:sz="0" w:space="0" w:color="FFFFFF"/>
+              <w:bottom w:val="single" w:sz="4" w:space="0" w:color="000000"/>
+              <w:right w:val="none" w:sz="0" w:space="0" w:color="FFFFFF"/>
+            </w:tcBorders>
+            <w:tcMar>
+              <w:top w:w="30" w:type="dxa"/>
+              <w:left w:w="0" w:type="dxa"/>
+              <w:bottom w:w="30" w:type="dxa"/>
+              <w:right w:w="120" w:type="dxa"/>
+            </w:tcMar>
+          </w:tcPr>
+          <w:p>
+            <w:pPr>
+              <w:spacing w:line="236" w:lineRule="auto"/>
+              <w:jc w:val="center"/>
+            </w:pPr>
+            <w:r>
+              <w:rPr>
+                <w:b/>
+                <w:bCs/>
+                <w:sz w:val="20"/>
+                <w:szCs w:val="20"/>
+              </w:rPr>
+              <w:t>Train</w:t>
+            </w:r>
+          </w:p>
+        </w:tc>
+        <w:tc>
+          <w:tcPr>
+            <w:tcW w:w="1500" w:type="dxa"/>
+            <w:tcBorders>
+              <w:top w:val="single" w:sz="4" w:space="0" w:color="000000"/>
+              <w:left w:val="none" w:sz="0" w:space="0" w:color="FFFFFF"/>
+              <w:bottom w:val="single" w:sz="4" w:space="0" w:color="000000"/>
+              <w:right w:val="none" w:sz="0" w:space="0" w:color="FFFFFF"/>
+            </w:tcBorders>
+            <w:tcMar>
+              <w:top w:w="30" w:type="dxa"/>
+              <w:left w:w="0" w:type="dxa"/>
+              <w:bottom w:w="30" w:type="dxa"/>
+              <w:right w:w="120" w:type="dxa"/>
+            </w:tcMar>
+          </w:tcPr>
+          <w:p>
+            <w:pPr>
+              <w:spacing w:line="236" w:lineRule="auto"/>
+              <w:jc w:val="center"/>
+            </w:pPr>
+            <w:r>
+              <w:rPr>
+                <w:b/>
+                <w:bCs/>
+                <w:sz w:val="20"/>
+                <w:szCs w:val="20"/>
+              </w:rPr>
+              <w:t>Val</w:t>
+            </w:r>
+          </w:p>
+        </w:tc>
+        <w:tc>
+          <w:tcPr>
+            <w:tcW w:w="1500" w:type="dxa"/>
+            <w:tcBorders>
+              <w:top w:val="single" w:sz="4" w:space="0" w:color="000000"/>
+              <w:left w:val="none" w:sz="0" w:space="0" w:color="FFFFFF"/>
+              <w:bottom w:val="single" w:sz="4" w:space="0" w:color="000000"/>
+              <w:right w:val="none" w:sz="0" w:space="0" w:color="FFFFFF"/>
+            </w:tcBorders>
+            <w:tcMar>
+              <w:top w:w="30" w:type="dxa"/>
+              <w:left w:w="0" w:type="dxa"/>
+              <w:bottom w:w="30" w:type="dxa"/>
+              <w:right w:w="120" w:type="dxa"/>
+            </w:tcMar>
+          </w:tcPr>
+          <w:p>
+            <w:pPr>
+              <w:spacing w:line="236" w:lineRule="auto"/>
+              <w:jc w:val="center"/>
+            </w:pPr>
+            <w:r>
+              <w:rPr>
+                <w:b/>
+                <w:bCs/>
+                <w:sz w:val="20"/>
+                <w:szCs w:val="20"/>
+              </w:rPr>
+              <w:t>Test</w:t>
+            </w:r>
+          </w:p>
+        </w:tc>
+        <w:tc>
+          <w:tcPr>
+            <w:tcW w:w="1500" w:type="dxa"/>
+            <w:tcBorders>
+              <w:top w:val="single" w:sz="4" w:space="0" w:color="000000"/>
+              <w:left w:val="none" w:sz="0" w:space="0" w:color="FFFFFF"/>
+              <w:bottom w:val="single" w:sz="4" w:space="0" w:color="000000"/>
+              <w:right w:val="none" w:sz="0" w:space="0" w:color="FFFFFF"/>
+            </w:tcBorders>
+            <w:tcMar>
+              <w:top w:w="30" w:type="dxa"/>
+              <w:left w:w="0" w:type="dxa"/>
+              <w:bottom w:w="30" w:type="dxa"/>
+              <w:right w:w="120" w:type="dxa"/>
+            </w:tcMar>
+          </w:tcPr>
+          <w:p>
+            <w:pPr>
+              <w:spacing w:line="236" w:lineRule="auto"/>
+              <w:jc w:val="center"/>
+            </w:pPr>
+            <w:r>
+              <w:rPr>
+                <w:b/>
+                <w:bCs/>
+                <w:sz w:val="20"/>
+                <w:szCs w:val="20"/>
+              </w:rPr>
+              <w:t>Total</w:t>
+            </w:r>
+          </w:p>
+        </w:tc>
+      </w:tr>
+      <w:tr>
+        <w:tblPrEx>
+          <w:tblCellMar>
+            <w:top w:w="0" w:type="dxa"/>
+            <w:bottom w:w="0" w:type="dxa"/>
+          </w:tblCellMar>
+        </w:tblPrEx>
+        <w:trPr>
+          <w:cantSplit/>
+          <w:jc w:val="center"/>
+        </w:trPr>
+        <w:tc>
+          <w:tcPr>
+            <w:tcW w:w="2200" w:type="dxa"/>
+            <w:tcBorders>
+              <w:top w:val="none" w:sz="0" w:space="0" w:color="FFFFFF"/>
+              <w:left w:val="none" w:sz="0" w:space="0" w:color="FFFFFF"/>
+              <w:bottom w:val="none" w:sz="0" w:space="0" w:color="FFFFFF"/>
+              <w:right w:val="none" w:sz="0" w:space="0" w:color="FFFFFF"/>
+            </w:tcBorders>
+            <w:tcMar>
+              <w:top w:w="30" w:type="dxa"/>
+              <w:left w:w="0" w:type="dxa"/>
+              <w:bottom w:w="30" w:type="dxa"/>
+              <w:right w:w="120" w:type="dxa"/>
+            </w:tcMar>
+          </w:tcPr>
+          <w:p>
+            <w:pPr>
+              <w:spacing w:line="236" w:lineRule="auto"/>
+            </w:pPr>
+            <w:r>
+              <w:rPr>
+                <w:sz w:val="20"/>
+                <w:szCs w:val="20"/>
+              </w:rPr>
+              <w:t>AnnualCrop</w:t>
+            </w:r>
+          </w:p>
+        </w:tc>
+        <w:tc>
+          <w:tcPr>
+            <w:tcW w:w="1500" w:type="dxa"/>
+            <w:tcBorders>
+              <w:top w:val="none" w:sz="0" w:space="0" w:color="FFFFFF"/>
+              <w:left w:val="none" w:sz="0" w:space="0" w:color="FFFFFF"/>
+              <w:bottom w:val="none" w:sz="0" w:space="0" w:color="FFFFFF"/>
+              <w:right w:val="none" w:sz="0" w:space="0" w:color="FFFFFF"/>
+            </w:tcBorders>
+            <w:tcMar>
+              <w:top w:w="30" w:type="dxa"/>
+              <w:left w:w="0" w:type="dxa"/>
+              <w:bottom w:w="30" w:type="dxa"/>
+              <w:right w:w="120" w:type="dxa"/>
+            </w:tcMar>
+          </w:tcPr>
+          <w:p>
+            <w:pPr>
+              <w:spacing w:line="236" w:lineRule="auto"/>
+              <w:jc w:val="center"/>
+            </w:pPr>
+            <w:r>
+              <w:rPr>
+                <w:sz w:val="20"/>
+                <w:szCs w:val="20"/>
+              </w:rPr>
+              <w:t>2,100</w:t>
+            </w:r>
+          </w:p>
+        </w:tc>
+        <w:tc>
+          <w:tcPr>
+            <w:tcW w:w="1500" w:type="dxa"/>
+            <w:tcBorders>
+              <w:top w:val="none" w:sz="0" w:space="0" w:color="FFFFFF"/>
+              <w:left w:val="none" w:sz="0" w:space="0" w:color="FFFFFF"/>
+              <w:bottom w:val="none" w:sz="0" w:space="0" w:color="FFFFFF"/>
+              <w:right w:val="none" w:sz="0" w:space="0" w:color="FFFFFF"/>
+            </w:tcBorders>
+            <w:tcMar>
+              <w:top w:w="30" w:type="dxa"/>
+              <w:left w:w="0" w:type="dxa"/>
+              <w:bottom w:w="30" w:type="dxa"/>
+              <w:right w:w="120" w:type="dxa"/>
+            </w:tcMar>
+          </w:tcPr>
+          <w:p>
+            <w:pPr>
+              <w:spacing w:line="236" w:lineRule="auto"/>
+              <w:jc w:val="center"/>
+            </w:pPr>
+            <w:r>
+              <w:rPr>
+                <w:sz w:val="20"/>
+                <w:szCs w:val="20"/>
+              </w:rPr>
+              <w:t>450</w:t>
+            </w:r>
+          </w:p>
+        </w:tc>
+        <w:tc>
+          <w:tcPr>
+            <w:tcW w:w="1500" w:type="dxa"/>
+            <w:tcBorders>
+              <w:top w:val="none" w:sz="0" w:space="0" w:color="FFFFFF"/>
+              <w:left w:val="none" w:sz="0" w:space="0" w:color="FFFFFF"/>
+              <w:bottom w:val="none" w:sz="0" w:space="0" w:color="FFFFFF"/>
+              <w:right w:val="none" w:sz="0" w:space="0" w:color="FFFFFF"/>
+            </w:tcBorders>
+            <w:tcMar>
+              <w:top w:w="30" w:type="dxa"/>
+              <w:left w:w="0" w:type="dxa"/>
+              <w:bottom w:w="30" w:type="dxa"/>
+              <w:right w:w="120" w:type="dxa"/>
+            </w:tcMar>
+          </w:tcPr>
+          <w:p>
+            <w:pPr>
+              <w:spacing w:line="236" w:lineRule="auto"/>
+              <w:jc w:val="center"/>
+            </w:pPr>
+            <w:r>
+              <w:rPr>
+                <w:sz w:val="20"/>
+                <w:szCs w:val="20"/>
+              </w:rPr>
+              <w:t>450</w:t>
+            </w:r>
+          </w:p>
+        </w:tc>
+        <w:tc>
+          <w:tcPr>
+            <w:tcW w:w="1500" w:type="dxa"/>
+            <w:tcBorders>
+              <w:top w:val="none" w:sz="0" w:space="0" w:color="FFFFFF"/>
+              <w:left w:val="none" w:sz="0" w:space="0" w:color="FFFFFF"/>
+              <w:bottom w:val="none" w:sz="0" w:space="0" w:color="FFFFFF"/>
+              <w:right w:val="none" w:sz="0" w:space="0" w:color="FFFFFF"/>
+            </w:tcBorders>
+            <w:tcMar>
+              <w:top w:w="30" w:type="dxa"/>
+              <w:left w:w="0" w:type="dxa"/>
+              <w:bottom w:w="30" w:type="dxa"/>
+              <w:right w:w="120" w:type="dxa"/>
+            </w:tcMar>
+          </w:tcPr>
+          <w:p>
+            <w:pPr>
+              <w:spacing w:line="236" w:lineRule="auto"/>
+              <w:jc w:val="center"/>
+            </w:pPr>
+            <w:r>
+              <w:rPr>
+                <w:sz w:val="20"/>
+                <w:szCs w:val="20"/>
+              </w:rPr>
+              <w:t>3,000</w:t>
+            </w:r>
+          </w:p>
+        </w:tc>
+      </w:tr>
+      <w:tr>
+        <w:tblPrEx>
+          <w:tblCellMar>
+            <w:top w:w="0" w:type="dxa"/>
+            <w:bottom w:w="0" w:type="dxa"/>
+          </w:tblCellMar>
+        </w:tblPrEx>
+        <w:trPr>
+          <w:cantSplit/>
+          <w:jc w:val="center"/>
+        </w:trPr>
+        <w:tc>
+          <w:tcPr>
+            <w:tcW w:w="2200" w:type="dxa"/>
+            <w:tcBorders>
+              <w:top w:val="none" w:sz="0" w:space="0" w:color="FFFFFF"/>
+              <w:left w:val="none" w:sz="0" w:space="0" w:color="FFFFFF"/>
+              <w:bottom w:val="none" w:sz="0" w:space="0" w:color="FFFFFF"/>
+              <w:right w:val="none" w:sz="0" w:space="0" w:color="FFFFFF"/>
+            </w:tcBorders>
+            <w:tcMar>
+              <w:top w:w="30" w:type="dxa"/>
+              <w:left w:w="0" w:type="dxa"/>
+              <w:bottom w:w="30" w:type="dxa"/>
+              <w:right w:w="120" w:type="dxa"/>
+            </w:tcMar>
+          </w:tcPr>
+          <w:p>
+            <w:pPr>
+              <w:spacing w:line="236" w:lineRule="auto"/>
+            </w:pPr>
+            <w:r>
+              <w:rPr>
+                <w:sz w:val="20"/>
+                <w:szCs w:val="20"/>
+              </w:rPr>
+              <w:t>Forest</w:t>
+            </w:r>
+          </w:p>
+        </w:tc>
+        <w:tc>
+          <w:tcPr>
+            <w:tcW w:w="1500" w:type="dxa"/>
+            <w:tcBorders>
+              <w:top w:val="none" w:sz="0" w:space="0" w:color="FFFFFF"/>
+              <w:left w:val="none" w:sz="0" w:space="0" w:color="FFFFFF"/>
+              <w:bottom w:val="none" w:sz="0" w:space="0" w:color="FFFFFF"/>
+              <w:right w:val="none" w:sz="0" w:space="0" w:color="FFFFFF"/>
+            </w:tcBorders>
+            <w:tcMar>
+              <w:top w:w="30" w:type="dxa"/>
+              <w:left w:w="0" w:type="dxa"/>
+              <w:bottom w:w="30" w:type="dxa"/>
+              <w:right w:w="120" w:type="dxa"/>
+            </w:tcMar>
+          </w:tcPr>
+          <w:p>
+            <w:pPr>
+              <w:spacing w:line="236" w:lineRule="auto"/>
+              <w:jc w:val="center"/>
+            </w:pPr>
+            <w:r>
+              <w:rPr>
+                <w:sz w:val="20"/>
+                <w:szCs w:val="20"/>
+              </w:rPr>
+              <w:t>2,100</w:t>
+            </w:r>
+          </w:p>
+        </w:tc>
+        <w:tc>
+          <w:tcPr>
+            <w:tcW w:w="1500" w:type="dxa"/>
+            <w:tcBorders>
+              <w:top w:val="none" w:sz="0" w:space="0" w:color="FFFFFF"/>
+              <w:left w:val="none" w:sz="0" w:space="0" w:color="FFFFFF"/>
+              <w:bottom w:val="none" w:sz="0" w:space="0" w:color="FFFFFF"/>
+              <w:right w:val="none" w:sz="0" w:space="0" w:color="FFFFFF"/>
+            </w:tcBorders>
+            <w:tcMar>
+              <w:top w:w="30" w:type="dxa"/>
+              <w:left w:w="0" w:type="dxa"/>
+              <w:bottom w:w="30" w:type="dxa"/>
+              <w:right w:w="120" w:type="dxa"/>
+            </w:tcMar>
+          </w:tcPr>
+          <w:p>
+            <w:pPr>
+              <w:spacing w:line="236" w:lineRule="auto"/>
+              <w:jc w:val="center"/>
+            </w:pPr>
+            <w:r>
+              <w:rPr>
+                <w:sz w:val="20"/>
+                <w:szCs w:val="20"/>
+              </w:rPr>
+              <w:t>450</w:t>
+            </w:r>
+          </w:p>
+        </w:tc>
+        <w:tc>
+          <w:tcPr>
+            <w:tcW w:w="1500" w:type="dxa"/>
+            <w:tcBorders>
+              <w:top w:val="none" w:sz="0" w:space="0" w:color="FFFFFF"/>
+              <w:left w:val="none" w:sz="0" w:space="0" w:color="FFFFFF"/>
+              <w:bottom w:val="none" w:sz="0" w:space="0" w:color="FFFFFF"/>
+              <w:right w:val="none" w:sz="0" w:space="0" w:color="FFFFFF"/>
+            </w:tcBorders>
+            <w:tcMar>
+              <w:top w:w="30" w:type="dxa"/>
+              <w:left w:w="0" w:type="dxa"/>
+              <w:bottom w:w="30" w:type="dxa"/>
+              <w:right w:w="120" w:type="dxa"/>
+            </w:tcMar>
+          </w:tcPr>
+          <w:p>
+            <w:pPr>
+              <w:spacing w:line="236" w:lineRule="auto"/>
+              <w:jc w:val="center"/>
+            </w:pPr>
+            <w:r>
+              <w:rPr>
+                <w:sz w:val="20"/>
+                <w:szCs w:val="20"/>
+              </w:rPr>
+              <w:t>450</w:t>
+            </w:r>
+          </w:p>
+        </w:tc>
+        <w:tc>
+          <w:tcPr>
+            <w:tcW w:w="1500" w:type="dxa"/>
+            <w:tcBorders>
+              <w:top w:val="none" w:sz="0" w:space="0" w:color="FFFFFF"/>
+              <w:left w:val="none" w:sz="0" w:space="0" w:color="FFFFFF"/>
+              <w:bottom w:val="none" w:sz="0" w:space="0" w:color="FFFFFF"/>
+              <w:right w:val="none" w:sz="0" w:space="0" w:color="FFFFFF"/>
+            </w:tcBorders>
+            <w:tcMar>
+              <w:top w:w="30" w:type="dxa"/>
+              <w:left w:w="0" w:type="dxa"/>
+              <w:bottom w:w="30" w:type="dxa"/>
+              <w:right w:w="120" w:type="dxa"/>
+            </w:tcMar>
+          </w:tcPr>
+          <w:p>
+            <w:pPr>
+              <w:spacing w:line="236" w:lineRule="auto"/>
+              <w:jc w:val="center"/>
+            </w:pPr>
+            <w:r>
+              <w:rPr>
+                <w:sz w:val="20"/>
+                <w:szCs w:val="20"/>
+              </w:rPr>
+              <w:t>3,000</w:t>
+            </w:r>
+          </w:p>
+        </w:tc>
+      </w:tr>
+      <w:tr>
+        <w:tblPrEx>
+          <w:tblCellMar>
+            <w:top w:w="0" w:type="dxa"/>
+            <w:bottom w:w="0" w:type="dxa"/>
+          </w:tblCellMar>
+        </w:tblPrEx>
+        <w:trPr>
+          <w:cantSplit/>
+          <w:jc w:val="center"/>
+        </w:trPr>
+        <w:tc>
+          <w:tcPr>
+            <w:tcW w:w="2200" w:type="dxa"/>
+            <w:tcBorders>
+              <w:top w:val="none" w:sz="0" w:space="0" w:color="FFFFFF"/>
+              <w:left w:val="none" w:sz="0" w:space="0" w:color="FFFFFF"/>
+              <w:bottom w:val="none" w:sz="0" w:space="0" w:color="FFFFFF"/>
+              <w:right w:val="none" w:sz="0" w:space="0" w:color="FFFFFF"/>
+            </w:tcBorders>
+            <w:tcMar>
+              <w:top w:w="30" w:type="dxa"/>
+              <w:left w:w="0" w:type="dxa"/>
+              <w:bottom w:w="30" w:type="dxa"/>
+              <w:right w:w="120" w:type="dxa"/>
+            </w:tcMar>
+          </w:tcPr>
+          <w:p>
+            <w:pPr>
+              <w:spacing w:line="236" w:lineRule="auto"/>
+            </w:pPr>
+            <w:r>
+              <w:rPr>
+                <w:sz w:val="20"/>
+                <w:szCs w:val="20"/>
+              </w:rPr>
+              <w:t>HerbaceousVegetation</w:t>
+            </w:r>
+          </w:p>
+        </w:tc>
+        <w:tc>
+          <w:tcPr>
+            <w:tcW w:w="1500" w:type="dxa"/>
+            <w:tcBorders>
+              <w:top w:val="none" w:sz="0" w:space="0" w:color="FFFFFF"/>
+              <w:left w:val="none" w:sz="0" w:space="0" w:color="FFFFFF"/>
+              <w:bottom w:val="none" w:sz="0" w:space="0" w:color="FFFFFF"/>
+              <w:right w:val="none" w:sz="0" w:space="0" w:color="FFFFFF"/>
+            </w:tcBorders>
+            <w:tcMar>
+              <w:top w:w="30" w:type="dxa"/>
+              <w:left w:w="0" w:type="dxa"/>
+              <w:bottom w:w="30" w:type="dxa"/>
+              <w:right w:w="120" w:type="dxa"/>
+            </w:tcMar>
+          </w:tcPr>
+          <w:p>
+            <w:pPr>
+              <w:spacing w:line="236" w:lineRule="auto"/>
+              <w:jc w:val="center"/>
+            </w:pPr>
+            <w:r>
+              <w:rPr>
+                <w:sz w:val="20"/>
+                <w:szCs w:val="20"/>
+              </w:rPr>
+              <w:t>2,100</w:t>
+            </w:r>
+          </w:p>
+        </w:tc>
+        <w:tc>
+          <w:tcPr>
+            <w:tcW w:w="1500" w:type="dxa"/>
+            <w:tcBorders>
+              <w:top w:val="none" w:sz="0" w:space="0" w:color="FFFFFF"/>
+              <w:left w:val="none" w:sz="0" w:space="0" w:color="FFFFFF"/>
+              <w:bottom w:val="none" w:sz="0" w:space="0" w:color="FFFFFF"/>
+              <w:right w:val="none" w:sz="0" w:space="0" w:color="FFFFFF"/>
+            </w:tcBorders>
+            <w:tcMar>
+              <w:top w:w="30" w:type="dxa"/>
+              <w:left w:w="0" w:type="dxa"/>
+              <w:bottom w:w="30" w:type="dxa"/>
+              <w:right w:w="120" w:type="dxa"/>
+            </w:tcMar>
+          </w:tcPr>
+          <w:p>
+            <w:pPr>
+              <w:spacing w:line="236" w:lineRule="auto"/>
+              <w:jc w:val="center"/>
+            </w:pPr>
+            <w:r>
+              <w:rPr>
+                <w:sz w:val="20"/>
+                <w:szCs w:val="20"/>
+              </w:rPr>
+              <w:t>450</w:t>
+            </w:r>
+          </w:p>
+        </w:tc>
+        <w:tc>
+          <w:tcPr>
+            <w:tcW w:w="1500" w:type="dxa"/>
+            <w:tcBorders>
+              <w:top w:val="none" w:sz="0" w:space="0" w:color="FFFFFF"/>
+              <w:left w:val="none" w:sz="0" w:space="0" w:color="FFFFFF"/>
+              <w:bottom w:val="none" w:sz="0" w:space="0" w:color="FFFFFF"/>
+              <w:right w:val="none" w:sz="0" w:space="0" w:color="FFFFFF"/>
+            </w:tcBorders>
+            <w:tcMar>
+              <w:top w:w="30" w:type="dxa"/>
+              <w:left w:w="0" w:type="dxa"/>
+              <w:bottom w:w="30" w:type="dxa"/>
+              <w:right w:w="120" w:type="dxa"/>
+            </w:tcMar>
+          </w:tcPr>
+          <w:p>
+            <w:pPr>
+              <w:spacing w:line="236" w:lineRule="auto"/>
+              <w:jc w:val="center"/>
+            </w:pPr>
+            <w:r>
+              <w:rPr>
+                <w:sz w:val="20"/>
+                <w:szCs w:val="20"/>
+              </w:rPr>
+              <w:t>450</w:t>
+            </w:r>
+          </w:p>
+        </w:tc>
+        <w:tc>
+          <w:tcPr>
+            <w:tcW w:w="1500" w:type="dxa"/>
+            <w:tcBorders>
+              <w:top w:val="none" w:sz="0" w:space="0" w:color="FFFFFF"/>
+              <w:left w:val="none" w:sz="0" w:space="0" w:color="FFFFFF"/>
+              <w:bottom w:val="none" w:sz="0" w:space="0" w:color="FFFFFF"/>
+              <w:right w:val="none" w:sz="0" w:space="0" w:color="FFFFFF"/>
+            </w:tcBorders>
+            <w:tcMar>
+              <w:top w:w="30" w:type="dxa"/>
+              <w:left w:w="0" w:type="dxa"/>
+              <w:bottom w:w="30" w:type="dxa"/>
+              <w:right w:w="120" w:type="dxa"/>
+            </w:tcMar>
+          </w:tcPr>
+          <w:p>
+            <w:pPr>
+              <w:spacing w:line="236" w:lineRule="auto"/>
+              <w:jc w:val="center"/>
+            </w:pPr>
+            <w:r>
+              <w:rPr>
+                <w:sz w:val="20"/>
+                <w:szCs w:val="20"/>
+              </w:rPr>
+              <w:t>3,000</w:t>
+            </w:r>
+          </w:p>
+        </w:tc>
+      </w:tr>
+      <w:tr>
+        <w:tblPrEx>
+          <w:tblCellMar>
+            <w:top w:w="0" w:type="dxa"/>
+            <w:bottom w:w="0" w:type="dxa"/>
+          </w:tblCellMar>
+        </w:tblPrEx>
+        <w:trPr>
+          <w:cantSplit/>
+          <w:jc w:val="center"/>
+        </w:trPr>
+        <w:tc>
+          <w:tcPr>
+            <w:tcW w:w="2200" w:type="dxa"/>
+            <w:tcBorders>
+              <w:top w:val="none" w:sz="0" w:space="0" w:color="FFFFFF"/>
+              <w:left w:val="none" w:sz="0" w:space="0" w:color="FFFFFF"/>
+              <w:bottom w:val="none" w:sz="0" w:space="0" w:color="FFFFFF"/>
+              <w:right w:val="none" w:sz="0" w:space="0" w:color="FFFFFF"/>
+            </w:tcBorders>
+            <w:tcMar>
+              <w:top w:w="30" w:type="dxa"/>
+              <w:left w:w="0" w:type="dxa"/>
+              <w:bottom w:w="30" w:type="dxa"/>
+              <w:right w:w="120" w:type="dxa"/>
+            </w:tcMar>
+          </w:tcPr>
+          <w:p>
+            <w:pPr>
+              <w:spacing w:line="236" w:lineRule="auto"/>
+            </w:pPr>
+            <w:r>
+              <w:rPr>
+                <w:sz w:val="20"/>
+                <w:szCs w:val="20"/>
+              </w:rPr>
+              <w:t>Highway</w:t>
+            </w:r>
+          </w:p>
+        </w:tc>
+        <w:tc>
+          <w:tcPr>
+            <w:tcW w:w="1500" w:type="dxa"/>
+            <w:tcBorders>
+              <w:top w:val="none" w:sz="0" w:space="0" w:color="FFFFFF"/>
+              <w:left w:val="none" w:sz="0" w:space="0" w:color="FFFFFF"/>
+              <w:bottom w:val="none" w:sz="0" w:space="0" w:color="FFFFFF"/>
+              <w:right w:val="none" w:sz="0" w:space="0" w:color="FFFFFF"/>
+            </w:tcBorders>
+            <w:tcMar>
+              <w:top w:w="30" w:type="dxa"/>
+              <w:left w:w="0" w:type="dxa"/>
+              <w:bottom w:w="30" w:type="dxa"/>
+              <w:right w:w="120" w:type="dxa"/>
+            </w:tcMar>
+          </w:tcPr>
+          <w:p>
+            <w:pPr>
+              <w:spacing w:line="236" w:lineRule="auto"/>
+              <w:jc w:val="center"/>
+            </w:pPr>
+            <w:r>
+              <w:rPr>
+                <w:sz w:val="20"/>
+                <w:szCs w:val="20"/>
+              </w:rPr>
+              <w:t>1,750</w:t>
+            </w:r>
+          </w:p>
+        </w:tc>
+        <w:tc>
+          <w:tcPr>
+            <w:tcW w:w="1500" w:type="dxa"/>
+            <w:tcBorders>
+              <w:top w:val="none" w:sz="0" w:space="0" w:color="FFFFFF"/>
+              <w:left w:val="none" w:sz="0" w:space="0" w:color="FFFFFF"/>
+              <w:bottom w:val="none" w:sz="0" w:space="0" w:color="FFFFFF"/>
+              <w:right w:val="none" w:sz="0" w:space="0" w:color="FFFFFF"/>
+            </w:tcBorders>
+            <w:tcMar>
+              <w:top w:w="30" w:type="dxa"/>
+              <w:left w:w="0" w:type="dxa"/>
+              <w:bottom w:w="30" w:type="dxa"/>
+              <w:right w:w="120" w:type="dxa"/>
+            </w:tcMar>
+          </w:tcPr>
+          <w:p>
+            <w:pPr>
+              <w:spacing w:line="236" w:lineRule="auto"/>
+              <w:jc w:val="center"/>
+            </w:pPr>
+            <w:r>
+              <w:rPr>
+                <w:sz w:val="20"/>
+                <w:szCs w:val="20"/>
+              </w:rPr>
+              <w:t>375</w:t>
+            </w:r>
+          </w:p>
+        </w:tc>
+        <w:tc>
+          <w:tcPr>
+            <w:tcW w:w="1500" w:type="dxa"/>
+            <w:tcBorders>
+              <w:top w:val="none" w:sz="0" w:space="0" w:color="FFFFFF"/>
+              <w:left w:val="none" w:sz="0" w:space="0" w:color="FFFFFF"/>
+              <w:bottom w:val="none" w:sz="0" w:space="0" w:color="FFFFFF"/>
+              <w:right w:val="none" w:sz="0" w:space="0" w:color="FFFFFF"/>
+            </w:tcBorders>
+            <w:tcMar>
+              <w:top w:w="30" w:type="dxa"/>
+              <w:left w:w="0" w:type="dxa"/>
+              <w:bottom w:w="30" w:type="dxa"/>
+              <w:right w:w="120" w:type="dxa"/>
+            </w:tcMar>
+          </w:tcPr>
+          <w:p>
+            <w:pPr>
+              <w:spacing w:line="236" w:lineRule="auto"/>
+              <w:jc w:val="center"/>
+            </w:pPr>
+            <w:r>
+              <w:rPr>
+                <w:sz w:val="20"/>
+                <w:szCs w:val="20"/>
+              </w:rPr>
+              <w:t>375</w:t>
+            </w:r>
+          </w:p>
+        </w:tc>
+        <w:tc>
+          <w:tcPr>
+            <w:tcW w:w="1500" w:type="dxa"/>
+            <w:tcBorders>
+              <w:top w:val="none" w:sz="0" w:space="0" w:color="FFFFFF"/>
+              <w:left w:val="none" w:sz="0" w:space="0" w:color="FFFFFF"/>
+              <w:bottom w:val="none" w:sz="0" w:space="0" w:color="FFFFFF"/>
+              <w:right w:val="none" w:sz="0" w:space="0" w:color="FFFFFF"/>
+            </w:tcBorders>
+            <w:tcMar>
+              <w:top w:w="30" w:type="dxa"/>
+              <w:left w:w="0" w:type="dxa"/>
+              <w:bottom w:w="30" w:type="dxa"/>
+              <w:right w:w="120" w:type="dxa"/>
+            </w:tcMar>
+          </w:tcPr>
+          <w:p>
+            <w:pPr>
+              <w:spacing w:line="236" w:lineRule="auto"/>
+              <w:jc w:val="center"/>
+            </w:pPr>
+            <w:r>
+              <w:rPr>
+                <w:sz w:val="20"/>
+                <w:szCs w:val="20"/>
+              </w:rPr>
+              <w:t>2,500</w:t>
+            </w:r>
+          </w:p>
+        </w:tc>
+      </w:tr>
+      <w:tr>
+        <w:tblPrEx>
+          <w:tblCellMar>
+            <w:top w:w="0" w:type="dxa"/>
+            <w:bottom w:w="0" w:type="dxa"/>
+          </w:tblCellMar>
+        </w:tblPrEx>
+        <w:trPr>
+          <w:cantSplit/>
+          <w:jc w:val="center"/>
+        </w:trPr>
+        <w:tc>
+          <w:tcPr>
+            <w:tcW w:w="2200" w:type="dxa"/>
+            <w:tcBorders>
+              <w:top w:val="none" w:sz="0" w:space="0" w:color="FFFFFF"/>
+              <w:left w:val="none" w:sz="0" w:space="0" w:color="FFFFFF"/>
+              <w:bottom w:val="none" w:sz="0" w:space="0" w:color="FFFFFF"/>
+              <w:right w:val="none" w:sz="0" w:space="0" w:color="FFFFFF"/>
+            </w:tcBorders>
+            <w:tcMar>
+              <w:top w:w="30" w:type="dxa"/>
+              <w:left w:w="0" w:type="dxa"/>
+              <w:bottom w:w="30" w:type="dxa"/>
+              <w:right w:w="120" w:type="dxa"/>
+            </w:tcMar>
+          </w:tcPr>
+          <w:p>
+            <w:pPr>
+              <w:spacing w:line="236" w:lineRule="auto"/>
+            </w:pPr>
+            <w:r>
+              <w:rPr>
+                <w:sz w:val="20"/>
+                <w:szCs w:val="20"/>
+              </w:rPr>
+              <w:t>Industrial</w:t>
+            </w:r>
+          </w:p>
+        </w:tc>
+        <w:tc>
+          <w:tcPr>
+            <w:tcW w:w="1500" w:type="dxa"/>
+            <w:tcBorders>
+              <w:top w:val="none" w:sz="0" w:space="0" w:color="FFFFFF"/>
+              <w:left w:val="none" w:sz="0" w:space="0" w:color="FFFFFF"/>
+              <w:bottom w:val="none" w:sz="0" w:space="0" w:color="FFFFFF"/>
+              <w:right w:val="none" w:sz="0" w:space="0" w:color="FFFFFF"/>
+            </w:tcBorders>
+            <w:tcMar>
+              <w:top w:w="30" w:type="dxa"/>
+              <w:left w:w="0" w:type="dxa"/>
+              <w:bottom w:w="30" w:type="dxa"/>
+              <w:right w:w="120" w:type="dxa"/>
+            </w:tcMar>
+          </w:tcPr>
+          <w:p>
+            <w:pPr>
+              <w:spacing w:line="236" w:lineRule="auto"/>
+              <w:jc w:val="center"/>
+            </w:pPr>
+            <w:r>
+              <w:rPr>
+                <w:sz w:val="20"/>
+                <w:szCs w:val="20"/>
+              </w:rPr>
+              <w:t>1,750</w:t>
+            </w:r>
+          </w:p>
+        </w:tc>
+        <w:tc>
+          <w:tcPr>
+            <w:tcW w:w="1500" w:type="dxa"/>
+            <w:tcBorders>
+              <w:top w:val="none" w:sz="0" w:space="0" w:color="FFFFFF"/>
+              <w:left w:val="none" w:sz="0" w:space="0" w:color="FFFFFF"/>
+              <w:bottom w:val="none" w:sz="0" w:space="0" w:color="FFFFFF"/>
+              <w:right w:val="none" w:sz="0" w:space="0" w:color="FFFFFF"/>
+            </w:tcBorders>
+            <w:tcMar>
+              <w:top w:w="30" w:type="dxa"/>
+              <w:left w:w="0" w:type="dxa"/>
+              <w:bottom w:w="30" w:type="dxa"/>
+              <w:right w:w="120" w:type="dxa"/>
+            </w:tcMar>
+          </w:tcPr>
+          <w:p>
+            <w:pPr>
+              <w:spacing w:line="236" w:lineRule="auto"/>
+              <w:jc w:val="center"/>
+            </w:pPr>
+            <w:r>
+              <w:rPr>
+                <w:sz w:val="20"/>
+                <w:szCs w:val="20"/>
+              </w:rPr>
+              <w:t>375</w:t>
+            </w:r>
+          </w:p>
+        </w:tc>
+        <w:tc>
+          <w:tcPr>
+            <w:tcW w:w="1500" w:type="dxa"/>
+            <w:tcBorders>
+              <w:top w:val="none" w:sz="0" w:space="0" w:color="FFFFFF"/>
+              <w:left w:val="none" w:sz="0" w:space="0" w:color="FFFFFF"/>
+              <w:bottom w:val="none" w:sz="0" w:space="0" w:color="FFFFFF"/>
+              <w:right w:val="none" w:sz="0" w:space="0" w:color="FFFFFF"/>
+            </w:tcBorders>
+            <w:tcMar>
+              <w:top w:w="30" w:type="dxa"/>
+              <w:left w:w="0" w:type="dxa"/>
+              <w:bottom w:w="30" w:type="dxa"/>
+              <w:right w:w="120" w:type="dxa"/>
+            </w:tcMar>
+          </w:tcPr>
+          <w:p>
+            <w:pPr>
+              <w:spacing w:line="236" w:lineRule="auto"/>
+              <w:jc w:val="center"/>
+            </w:pPr>
+            <w:r>
+              <w:rPr>
+                <w:sz w:val="20"/>
+                <w:szCs w:val="20"/>
+              </w:rPr>
+              <w:t>375</w:t>
+            </w:r>
+          </w:p>
+        </w:tc>
+        <w:tc>
+          <w:tcPr>
+            <w:tcW w:w="1500" w:type="dxa"/>
+            <w:tcBorders>
+              <w:top w:val="none" w:sz="0" w:space="0" w:color="FFFFFF"/>
+              <w:left w:val="none" w:sz="0" w:space="0" w:color="FFFFFF"/>
+              <w:bottom w:val="none" w:sz="0" w:space="0" w:color="FFFFFF"/>
+              <w:right w:val="none" w:sz="0" w:space="0" w:color="FFFFFF"/>
+            </w:tcBorders>
+            <w:tcMar>
+              <w:top w:w="30" w:type="dxa"/>
+              <w:left w:w="0" w:type="dxa"/>
+              <w:bottom w:w="30" w:type="dxa"/>
+              <w:right w:w="120" w:type="dxa"/>
+            </w:tcMar>
+          </w:tcPr>
+          <w:p>
+            <w:pPr>
+              <w:spacing w:line="236" w:lineRule="auto"/>
+              <w:jc w:val="center"/>
+            </w:pPr>
+            <w:r>
+              <w:rPr>
+                <w:sz w:val="20"/>
+                <w:szCs w:val="20"/>
+              </w:rPr>
+              <w:t>2,500</w:t>
+            </w:r>
+          </w:p>
+        </w:tc>
+      </w:tr>
+      <w:tr>
+        <w:tblPrEx>
+          <w:tblCellMar>
+            <w:top w:w="0" w:type="dxa"/>
+            <w:bottom w:w="0" w:type="dxa"/>
+          </w:tblCellMar>
+        </w:tblPrEx>
+        <w:trPr>
+          <w:cantSplit/>
+          <w:jc w:val="center"/>
+        </w:trPr>
+        <w:tc>
+          <w:tcPr>
+            <w:tcW w:w="2200" w:type="dxa"/>
+            <w:tcBorders>
+              <w:top w:val="none" w:sz="0" w:space="0" w:color="FFFFFF"/>
+              <w:left w:val="none" w:sz="0" w:space="0" w:color="FFFFFF"/>
+              <w:bottom w:val="none" w:sz="0" w:space="0" w:color="FFFFFF"/>
+              <w:right w:val="none" w:sz="0" w:space="0" w:color="FFFFFF"/>
+            </w:tcBorders>
+            <w:tcMar>
+              <w:top w:w="30" w:type="dxa"/>
+              <w:left w:w="0" w:type="dxa"/>
+              <w:bottom w:w="30" w:type="dxa"/>
+              <w:right w:w="120" w:type="dxa"/>
+            </w:tcMar>
+          </w:tcPr>
+          <w:p>
+            <w:pPr>
+              <w:spacing w:line="236" w:lineRule="auto"/>
+            </w:pPr>
+            <w:r>
+              <w:rPr>
+                <w:sz w:val="20"/>
+                <w:szCs w:val="20"/>
+              </w:rPr>
+              <w:t>Pasture</w:t>
+            </w:r>
+          </w:p>
+        </w:tc>
+        <w:tc>
+          <w:tcPr>
+            <w:tcW w:w="1500" w:type="dxa"/>
+            <w:tcBorders>
+              <w:top w:val="none" w:sz="0" w:space="0" w:color="FFFFFF"/>
+              <w:left w:val="none" w:sz="0" w:space="0" w:color="FFFFFF"/>
+              <w:bottom w:val="none" w:sz="0" w:space="0" w:color="FFFFFF"/>
+              <w:right w:val="none" w:sz="0" w:space="0" w:color="FFFFFF"/>
+            </w:tcBorders>
+            <w:tcMar>
+              <w:top w:w="30" w:type="dxa"/>
+              <w:left w:w="0" w:type="dxa"/>
+              <w:bottom w:w="30" w:type="dxa"/>
+              <w:right w:w="120" w:type="dxa"/>
+            </w:tcMar>
+          </w:tcPr>
+          <w:p>
+            <w:pPr>
+              <w:spacing w:line="236" w:lineRule="auto"/>
+              <w:jc w:val="center"/>
+            </w:pPr>
+            <w:r>
+              <w:rPr>
+                <w:sz w:val="20"/>
+                <w:szCs w:val="20"/>
+              </w:rPr>
+              <w:t>1,400</w:t>
+            </w:r>
+          </w:p>
+        </w:tc>
+        <w:tc>
+          <w:tcPr>
+            <w:tcW w:w="1500" w:type="dxa"/>
+            <w:tcBorders>
+              <w:top w:val="none" w:sz="0" w:space="0" w:color="FFFFFF"/>
+              <w:left w:val="none" w:sz="0" w:space="0" w:color="FFFFFF"/>
+              <w:bottom w:val="none" w:sz="0" w:space="0" w:color="FFFFFF"/>
+              <w:right w:val="none" w:sz="0" w:space="0" w:color="FFFFFF"/>
+            </w:tcBorders>
+            <w:tcMar>
+              <w:top w:w="30" w:type="dxa"/>
+              <w:left w:w="0" w:type="dxa"/>
+              <w:bottom w:w="30" w:type="dxa"/>
+              <w:right w:w="120" w:type="dxa"/>
+            </w:tcMar>
+          </w:tcPr>
+          <w:p>
+            <w:pPr>
+              <w:spacing w:line="236" w:lineRule="auto"/>
+              <w:jc w:val="center"/>
+            </w:pPr>
+            <w:r>
+              <w:rPr>
+                <w:sz w:val="20"/>
+                <w:szCs w:val="20"/>
+              </w:rPr>
+              <w:t>300</w:t>
+            </w:r>
+          </w:p>
+        </w:tc>
+        <w:tc>
+          <w:tcPr>
+            <w:tcW w:w="1500" w:type="dxa"/>
+            <w:tcBorders>
+              <w:top w:val="none" w:sz="0" w:space="0" w:color="FFFFFF"/>
+              <w:left w:val="none" w:sz="0" w:space="0" w:color="FFFFFF"/>
+              <w:bottom w:val="none" w:sz="0" w:space="0" w:color="FFFFFF"/>
+              <w:right w:val="none" w:sz="0" w:space="0" w:color="FFFFFF"/>
+            </w:tcBorders>
+            <w:tcMar>
+              <w:top w:w="30" w:type="dxa"/>
+              <w:left w:w="0" w:type="dxa"/>
+              <w:bottom w:w="30" w:type="dxa"/>
+              <w:right w:w="120" w:type="dxa"/>
+            </w:tcMar>
+          </w:tcPr>
+          <w:p>
+            <w:pPr>
+              <w:spacing w:line="236" w:lineRule="auto"/>
+              <w:jc w:val="center"/>
+            </w:pPr>
+            <w:r>
+              <w:rPr>
+                <w:sz w:val="20"/>
+                <w:szCs w:val="20"/>
+              </w:rPr>
+              <w:t>300</w:t>
+            </w:r>
+          </w:p>
+        </w:tc>
+        <w:tc>
+          <w:tcPr>
+            <w:tcW w:w="1500" w:type="dxa"/>
+            <w:tcBorders>
+              <w:top w:val="none" w:sz="0" w:space="0" w:color="FFFFFF"/>
+              <w:left w:val="none" w:sz="0" w:space="0" w:color="FFFFFF"/>
+              <w:bottom w:val="none" w:sz="0" w:space="0" w:color="FFFFFF"/>
+              <w:right w:val="none" w:sz="0" w:space="0" w:color="FFFFFF"/>
+            </w:tcBorders>
+            <w:tcMar>
+              <w:top w:w="30" w:type="dxa"/>
+              <w:left w:w="0" w:type="dxa"/>
+              <w:bottom w:w="30" w:type="dxa"/>
+              <w:right w:w="120" w:type="dxa"/>
+            </w:tcMar>
+          </w:tcPr>
+          <w:p>
+            <w:pPr>
+              <w:spacing w:line="236" w:lineRule="auto"/>
+              <w:jc w:val="center"/>
+            </w:pPr>
+            <w:r>
+              <w:rPr>
+                <w:sz w:val="20"/>
+                <w:szCs w:val="20"/>
+              </w:rPr>
+              <w:t>2,000</w:t>
+            </w:r>
+          </w:p>
+        </w:tc>
+      </w:tr>
+      <w:tr>
+        <w:tblPrEx>
+          <w:tblCellMar>
+            <w:top w:w="0" w:type="dxa"/>
+            <w:bottom w:w="0" w:type="dxa"/>
+          </w:tblCellMar>
+        </w:tblPrEx>
+        <w:trPr>
+          <w:cantSplit/>
+          <w:jc w:val="center"/>
+        </w:trPr>
+        <w:tc>
+          <w:tcPr>
+            <w:tcW w:w="2200" w:type="dxa"/>
+            <w:tcBorders>
+              <w:top w:val="none" w:sz="0" w:space="0" w:color="FFFFFF"/>
+              <w:left w:val="none" w:sz="0" w:space="0" w:color="FFFFFF"/>
+              <w:bottom w:val="none" w:sz="0" w:space="0" w:color="FFFFFF"/>
+              <w:right w:val="none" w:sz="0" w:space="0" w:color="FFFFFF"/>
+            </w:tcBorders>
+            <w:tcMar>
+              <w:top w:w="30" w:type="dxa"/>
+              <w:left w:w="0" w:type="dxa"/>
+              <w:bottom w:w="30" w:type="dxa"/>
+              <w:right w:w="120" w:type="dxa"/>
+            </w:tcMar>
+          </w:tcPr>
+          <w:p>
+            <w:pPr>
+              <w:spacing w:line="236" w:lineRule="auto"/>
+            </w:pPr>
+            <w:r>
+              <w:rPr>
+                <w:sz w:val="20"/>
+                <w:szCs w:val="20"/>
+              </w:rPr>
+              <w:t>PermanentCrop</w:t>
+            </w:r>
+          </w:p>
+        </w:tc>
+        <w:tc>
+          <w:tcPr>
+            <w:tcW w:w="1500" w:type="dxa"/>
+            <w:tcBorders>
+              <w:top w:val="none" w:sz="0" w:space="0" w:color="FFFFFF"/>
+              <w:left w:val="none" w:sz="0" w:space="0" w:color="FFFFFF"/>
+              <w:bottom w:val="none" w:sz="0" w:space="0" w:color="FFFFFF"/>
+              <w:right w:val="none" w:sz="0" w:space="0" w:color="FFFFFF"/>
+            </w:tcBorders>
+            <w:tcMar>
+              <w:top w:w="30" w:type="dxa"/>
+              <w:left w:w="0" w:type="dxa"/>
+              <w:bottom w:w="30" w:type="dxa"/>
+              <w:right w:w="120" w:type="dxa"/>
+            </w:tcMar>
+          </w:tcPr>
+          <w:p>
+            <w:pPr>
+              <w:spacing w:line="236" w:lineRule="auto"/>
+              <w:jc w:val="center"/>
+            </w:pPr>
+            <w:r>
+              <w:rPr>
+                <w:sz w:val="20"/>
+                <w:szCs w:val="20"/>
+              </w:rPr>
+              <w:t>1,750</w:t>
+            </w:r>
+          </w:p>
+        </w:tc>
+        <w:tc>
+          <w:tcPr>
+            <w:tcW w:w="1500" w:type="dxa"/>
+            <w:tcBorders>
+              <w:top w:val="none" w:sz="0" w:space="0" w:color="FFFFFF"/>
+              <w:left w:val="none" w:sz="0" w:space="0" w:color="FFFFFF"/>
+              <w:bottom w:val="none" w:sz="0" w:space="0" w:color="FFFFFF"/>
+              <w:right w:val="none" w:sz="0" w:space="0" w:color="FFFFFF"/>
+            </w:tcBorders>
+            <w:tcMar>
+              <w:top w:w="30" w:type="dxa"/>
+              <w:left w:w="0" w:type="dxa"/>
+              <w:bottom w:w="30" w:type="dxa"/>
+              <w:right w:w="120" w:type="dxa"/>
+            </w:tcMar>
+          </w:tcPr>
+          <w:p>
+            <w:pPr>
+              <w:spacing w:line="236" w:lineRule="auto"/>
+              <w:jc w:val="center"/>
+            </w:pPr>
+            <w:r>
+              <w:rPr>
+                <w:sz w:val="20"/>
+                <w:szCs w:val="20"/>
+              </w:rPr>
+              <w:t>375</w:t>
+            </w:r>
+          </w:p>
+        </w:tc>
+        <w:tc>
+          <w:tcPr>
+            <w:tcW w:w="1500" w:type="dxa"/>
+            <w:tcBorders>
+              <w:top w:val="none" w:sz="0" w:space="0" w:color="FFFFFF"/>
+              <w:left w:val="none" w:sz="0" w:space="0" w:color="FFFFFF"/>
+              <w:bottom w:val="none" w:sz="0" w:space="0" w:color="FFFFFF"/>
+              <w:right w:val="none" w:sz="0" w:space="0" w:color="FFFFFF"/>
+            </w:tcBorders>
+            <w:tcMar>
+              <w:top w:w="30" w:type="dxa"/>
+              <w:left w:w="0" w:type="dxa"/>
+              <w:bottom w:w="30" w:type="dxa"/>
+              <w:right w:w="120" w:type="dxa"/>
+            </w:tcMar>
+          </w:tcPr>
+          <w:p>
+            <w:pPr>
+              <w:spacing w:line="236" w:lineRule="auto"/>
+              <w:jc w:val="center"/>
+            </w:pPr>
+            <w:r>
+              <w:rPr>
+                <w:sz w:val="20"/>
+                <w:szCs w:val="20"/>
+              </w:rPr>
+              <w:t>375</w:t>
+            </w:r>
+          </w:p>
+        </w:tc>
+        <w:tc>
+          <w:tcPr>
+            <w:tcW w:w="1500" w:type="dxa"/>
+            <w:tcBorders>
+              <w:top w:val="none" w:sz="0" w:space="0" w:color="FFFFFF"/>
+              <w:left w:val="none" w:sz="0" w:space="0" w:color="FFFFFF"/>
+              <w:bottom w:val="none" w:sz="0" w:space="0" w:color="FFFFFF"/>
+              <w:right w:val="none" w:sz="0" w:space="0" w:color="FFFFFF"/>
+            </w:tcBorders>
+            <w:tcMar>
+              <w:top w:w="30" w:type="dxa"/>
+              <w:left w:w="0" w:type="dxa"/>
+              <w:bottom w:w="30" w:type="dxa"/>
+              <w:right w:w="120" w:type="dxa"/>
+            </w:tcMar>
+          </w:tcPr>
+          <w:p>
+            <w:pPr>
+              <w:spacing w:line="236" w:lineRule="auto"/>
+              <w:jc w:val="center"/>
+            </w:pPr>
+            <w:r>
+              <w:rPr>
+                <w:sz w:val="20"/>
+                <w:szCs w:val="20"/>
+              </w:rPr>
+              <w:t>2,500</w:t>
+            </w:r>
+          </w:p>
+        </w:tc>
+      </w:tr>
+      <w:tr>
+        <w:tblPrEx>
+          <w:tblCellMar>
+            <w:top w:w="0" w:type="dxa"/>
+            <w:bottom w:w="0" w:type="dxa"/>
+          </w:tblCellMar>
+        </w:tblPrEx>
+        <w:trPr>
+          <w:cantSplit/>
+          <w:jc w:val="center"/>
+        </w:trPr>
+        <w:tc>
+          <w:tcPr>
+            <w:tcW w:w="2200" w:type="dxa"/>
+            <w:tcBorders>
+              <w:top w:val="none" w:sz="0" w:space="0" w:color="FFFFFF"/>
+              <w:left w:val="none" w:sz="0" w:space="0" w:color="FFFFFF"/>
+              <w:bottom w:val="none" w:sz="0" w:space="0" w:color="FFFFFF"/>
+              <w:right w:val="none" w:sz="0" w:space="0" w:color="FFFFFF"/>
+            </w:tcBorders>
+            <w:tcMar>
+              <w:top w:w="30" w:type="dxa"/>
+              <w:left w:w="0" w:type="dxa"/>
+              <w:bottom w:w="30" w:type="dxa"/>
+              <w:right w:w="120" w:type="dxa"/>
+            </w:tcMar>
+          </w:tcPr>
+          <w:p>
+            <w:pPr>
+              <w:spacing w:line="236" w:lineRule="auto"/>
+            </w:pPr>
+            <w:r>
+              <w:rPr>
+                <w:sz w:val="20"/>
+                <w:szCs w:val="20"/>
+              </w:rPr>
+              <w:t>Residential</w:t>
+            </w:r>
+          </w:p>
+        </w:tc>
+        <w:tc>
+          <w:tcPr>
+            <w:tcW w:w="1500" w:type="dxa"/>
+            <w:tcBorders>
+              <w:top w:val="none" w:sz="0" w:space="0" w:color="FFFFFF"/>
+              <w:left w:val="none" w:sz="0" w:space="0" w:color="FFFFFF"/>
+              <w:bottom w:val="none" w:sz="0" w:space="0" w:color="FFFFFF"/>
+              <w:right w:val="none" w:sz="0" w:space="0" w:color="FFFFFF"/>
+            </w:tcBorders>
+            <w:tcMar>
+              <w:top w:w="30" w:type="dxa"/>
+              <w:left w:w="0" w:type="dxa"/>
+              <w:bottom w:w="30" w:type="dxa"/>
+              <w:right w:w="120" w:type="dxa"/>
+            </w:tcMar>
+          </w:tcPr>
+          <w:p>
+            <w:pPr>
+              <w:spacing w:line="236" w:lineRule="auto"/>
+              <w:jc w:val="center"/>
+            </w:pPr>
+            <w:r>
+              <w:rPr>
+                <w:sz w:val="20"/>
+                <w:szCs w:val="20"/>
+              </w:rPr>
+              <w:t>2,100</w:t>
+            </w:r>
+          </w:p>
+        </w:tc>
+        <w:tc>
+          <w:tcPr>
+            <w:tcW w:w="1500" w:type="dxa"/>
+            <w:tcBorders>
+              <w:top w:val="none" w:sz="0" w:space="0" w:color="FFFFFF"/>
+              <w:left w:val="none" w:sz="0" w:space="0" w:color="FFFFFF"/>
+              <w:bottom w:val="none" w:sz="0" w:space="0" w:color="FFFFFF"/>
+              <w:right w:val="none" w:sz="0" w:space="0" w:color="FFFFFF"/>
+            </w:tcBorders>
+            <w:tcMar>
+              <w:top w:w="30" w:type="dxa"/>
+              <w:left w:w="0" w:type="dxa"/>
+              <w:bottom w:w="30" w:type="dxa"/>
+              <w:right w:w="120" w:type="dxa"/>
+            </w:tcMar>
+          </w:tcPr>
+          <w:p>
+            <w:pPr>
+              <w:spacing w:line="236" w:lineRule="auto"/>
+              <w:jc w:val="center"/>
+            </w:pPr>
+            <w:r>
+              <w:rPr>
+                <w:sz w:val="20"/>
+                <w:szCs w:val="20"/>
+              </w:rPr>
+              <w:t>450</w:t>
+            </w:r>
+          </w:p>
+        </w:tc>
+        <w:tc>
+          <w:tcPr>
+            <w:tcW w:w="1500" w:type="dxa"/>
+            <w:tcBorders>
+              <w:top w:val="none" w:sz="0" w:space="0" w:color="FFFFFF"/>
+              <w:left w:val="none" w:sz="0" w:space="0" w:color="FFFFFF"/>
+              <w:bottom w:val="none" w:sz="0" w:space="0" w:color="FFFFFF"/>
+              <w:right w:val="none" w:sz="0" w:space="0" w:color="FFFFFF"/>
+            </w:tcBorders>
+            <w:tcMar>
+              <w:top w:w="30" w:type="dxa"/>
+              <w:left w:w="0" w:type="dxa"/>
+              <w:bottom w:w="30" w:type="dxa"/>
+              <w:right w:w="120" w:type="dxa"/>
+            </w:tcMar>
+          </w:tcPr>
+          <w:p>
+            <w:pPr>
+              <w:spacing w:line="236" w:lineRule="auto"/>
+              <w:jc w:val="center"/>
+            </w:pPr>
+            <w:r>
+              <w:rPr>
+                <w:sz w:val="20"/>
+                <w:szCs w:val="20"/>
+              </w:rPr>
+              <w:t>450</w:t>
+            </w:r>
+          </w:p>
+        </w:tc>
+        <w:tc>
+          <w:tcPr>
+            <w:tcW w:w="1500" w:type="dxa"/>
+            <w:tcBorders>
+              <w:top w:val="none" w:sz="0" w:space="0" w:color="FFFFFF"/>
+              <w:left w:val="none" w:sz="0" w:space="0" w:color="FFFFFF"/>
+              <w:bottom w:val="none" w:sz="0" w:space="0" w:color="FFFFFF"/>
+              <w:right w:val="none" w:sz="0" w:space="0" w:color="FFFFFF"/>
+            </w:tcBorders>
+            <w:tcMar>
+              <w:top w:w="30" w:type="dxa"/>
+              <w:left w:w="0" w:type="dxa"/>
+              <w:bottom w:w="30" w:type="dxa"/>
+              <w:right w:w="120" w:type="dxa"/>
+            </w:tcMar>
+          </w:tcPr>
+          <w:p>
+            <w:pPr>
+              <w:spacing w:line="236" w:lineRule="auto"/>
+              <w:jc w:val="center"/>
+            </w:pPr>
+            <w:r>
+              <w:rPr>
+                <w:sz w:val="20"/>
+                <w:szCs w:val="20"/>
+              </w:rPr>
+              <w:t>3,000</w:t>
+            </w:r>
+          </w:p>
+        </w:tc>
+      </w:tr>
+      <w:tr>
+        <w:tblPrEx>
+          <w:tblCellMar>
+            <w:top w:w="0" w:type="dxa"/>
+            <w:bottom w:w="0" w:type="dxa"/>
+          </w:tblCellMar>
+        </w:tblPrEx>
+        <w:trPr>
+          <w:cantSplit/>
+          <w:jc w:val="center"/>
+        </w:trPr>
+        <w:tc>
+          <w:tcPr>
+            <w:tcW w:w="2200" w:type="dxa"/>
+            <w:tcBorders>
+              <w:top w:val="none" w:sz="0" w:space="0" w:color="FFFFFF"/>
+              <w:left w:val="none" w:sz="0" w:space="0" w:color="FFFFFF"/>
+              <w:bottom w:val="none" w:sz="0" w:space="0" w:color="FFFFFF"/>
+              <w:right w:val="none" w:sz="0" w:space="0" w:color="FFFFFF"/>
+            </w:tcBorders>
+            <w:tcMar>
+              <w:top w:w="30" w:type="dxa"/>
+              <w:left w:w="0" w:type="dxa"/>
+              <w:bottom w:w="30" w:type="dxa"/>
+              <w:right w:w="120" w:type="dxa"/>
+            </w:tcMar>
+          </w:tcPr>
+          <w:p>
+            <w:pPr>
+              <w:spacing w:line="236" w:lineRule="auto"/>
+            </w:pPr>
+            <w:r>
+              <w:rPr>
+                <w:sz w:val="20"/>
+                <w:szCs w:val="20"/>
+              </w:rPr>
+              <w:t>River</w:t>
+            </w:r>
+          </w:p>
+        </w:tc>
+        <w:tc>
+          <w:tcPr>
+            <w:tcW w:w="1500" w:type="dxa"/>
+            <w:tcBorders>
+              <w:top w:val="none" w:sz="0" w:space="0" w:color="FFFFFF"/>
+              <w:left w:val="none" w:sz="0" w:space="0" w:color="FFFFFF"/>
+              <w:bottom w:val="none" w:sz="0" w:space="0" w:color="FFFFFF"/>
+              <w:right w:val="none" w:sz="0" w:space="0" w:color="FFFFFF"/>
+            </w:tcBorders>
+            <w:tcMar>
+              <w:top w:w="30" w:type="dxa"/>
+              <w:left w:w="0" w:type="dxa"/>
+              <w:bottom w:w="30" w:type="dxa"/>
+              <w:right w:w="120" w:type="dxa"/>
+            </w:tcMar>
+          </w:tcPr>
+          <w:p>
+            <w:pPr>
+              <w:spacing w:line="236" w:lineRule="auto"/>
+              <w:jc w:val="center"/>
+            </w:pPr>
+            <w:r>
+              <w:rPr>
+                <w:sz w:val="20"/>
+                <w:szCs w:val="20"/>
+              </w:rPr>
+              <w:t>1,750</w:t>
+            </w:r>
+          </w:p>
+        </w:tc>
+        <w:tc>
+          <w:tcPr>
+            <w:tcW w:w="1500" w:type="dxa"/>
+            <w:tcBorders>
+              <w:top w:val="none" w:sz="0" w:space="0" w:color="FFFFFF"/>
+              <w:left w:val="none" w:sz="0" w:space="0" w:color="FFFFFF"/>
+              <w:bottom w:val="none" w:sz="0" w:space="0" w:color="FFFFFF"/>
+              <w:right w:val="none" w:sz="0" w:space="0" w:color="FFFFFF"/>
+            </w:tcBorders>
+            <w:tcMar>
+              <w:top w:w="30" w:type="dxa"/>
+              <w:left w:w="0" w:type="dxa"/>
+              <w:bottom w:w="30" w:type="dxa"/>
+              <w:right w:w="120" w:type="dxa"/>
+            </w:tcMar>
+          </w:tcPr>
+          <w:p>
+            <w:pPr>
+              <w:spacing w:line="236" w:lineRule="auto"/>
+              <w:jc w:val="center"/>
+            </w:pPr>
+            <w:r>
+              <w:rPr>
+                <w:sz w:val="20"/>
+                <w:szCs w:val="20"/>
+              </w:rPr>
+              <w:t>375</w:t>
+            </w:r>
+          </w:p>
+        </w:tc>
+        <w:tc>
+          <w:tcPr>
+            <w:tcW w:w="1500" w:type="dxa"/>
+            <w:tcBorders>
+              <w:top w:val="none" w:sz="0" w:space="0" w:color="FFFFFF"/>
+              <w:left w:val="none" w:sz="0" w:space="0" w:color="FFFFFF"/>
+              <w:bottom w:val="none" w:sz="0" w:space="0" w:color="FFFFFF"/>
+              <w:right w:val="none" w:sz="0" w:space="0" w:color="FFFFFF"/>
+            </w:tcBorders>
+            <w:tcMar>
+              <w:top w:w="30" w:type="dxa"/>
+              <w:left w:w="0" w:type="dxa"/>
+              <w:bottom w:w="30" w:type="dxa"/>
+              <w:right w:w="120" w:type="dxa"/>
+            </w:tcMar>
+          </w:tcPr>
+          <w:p>
+            <w:pPr>
+              <w:spacing w:line="236" w:lineRule="auto"/>
+              <w:jc w:val="center"/>
+            </w:pPr>
+            <w:r>
+              <w:rPr>
+                <w:sz w:val="20"/>
+                <w:szCs w:val="20"/>
+              </w:rPr>
+              <w:t>375</w:t>
+            </w:r>
+          </w:p>
+        </w:tc>
+        <w:tc>
+          <w:tcPr>
+            <w:tcW w:w="1500" w:type="dxa"/>
+            <w:tcBorders>
+              <w:top w:val="none" w:sz="0" w:space="0" w:color="FFFFFF"/>
+              <w:left w:val="none" w:sz="0" w:space="0" w:color="FFFFFF"/>
+              <w:bottom w:val="none" w:sz="0" w:space="0" w:color="FFFFFF"/>
+              <w:right w:val="none" w:sz="0" w:space="0" w:color="FFFFFF"/>
+            </w:tcBorders>
+            <w:tcMar>
+              <w:top w:w="30" w:type="dxa"/>
+              <w:left w:w="0" w:type="dxa"/>
+              <w:bottom w:w="30" w:type="dxa"/>
+              <w:right w:w="120" w:type="dxa"/>
+            </w:tcMar>
+          </w:tcPr>
+          <w:p>
+            <w:pPr>
+              <w:spacing w:line="236" w:lineRule="auto"/>
+              <w:jc w:val="center"/>
+            </w:pPr>
+            <w:r>
+              <w:rPr>
+                <w:sz w:val="20"/>
+                <w:szCs w:val="20"/>
+              </w:rPr>
+              <w:t>2,500</w:t>
+            </w:r>
+          </w:p>
+        </w:tc>
+      </w:tr>
+      <w:tr>
+        <w:tblPrEx>
+          <w:tblCellMar>
+            <w:top w:w="0" w:type="dxa"/>
+            <w:bottom w:w="0" w:type="dxa"/>
+          </w:tblCellMar>
+        </w:tblPrEx>
+        <w:trPr>
+          <w:cantSplit/>
+          <w:jc w:val="center"/>
+        </w:trPr>
+        <w:tc>
+          <w:tcPr>
+            <w:tcW w:w="2200" w:type="dxa"/>
+            <w:tcBorders>
+              <w:top w:val="none" w:sz="0" w:space="0" w:color="FFFFFF"/>
+              <w:left w:val="none" w:sz="0" w:space="0" w:color="FFFFFF"/>
+              <w:bottom w:val="none" w:sz="0" w:space="0" w:color="FFFFFF"/>
+              <w:right w:val="none" w:sz="0" w:space="0" w:color="FFFFFF"/>
+            </w:tcBorders>
+            <w:tcMar>
+              <w:top w:w="30" w:type="dxa"/>
+              <w:left w:w="0" w:type="dxa"/>
+              <w:bottom w:w="30" w:type="dxa"/>
+              <w:right w:w="120" w:type="dxa"/>
+            </w:tcMar>
+          </w:tcPr>
+          <w:p>
+            <w:pPr>
+              <w:spacing w:line="236" w:lineRule="auto"/>
+            </w:pPr>
+            <w:r>
+              <w:rPr>
+                <w:sz w:val="20"/>
+                <w:szCs w:val="20"/>
+              </w:rPr>
+              <w:t>SeaLake</w:t>
+            </w:r>
+          </w:p>
+        </w:tc>
+        <w:tc>
+          <w:tcPr>
+            <w:tcW w:w="1500" w:type="dxa"/>
+            <w:tcBorders>
+              <w:top w:val="none" w:sz="0" w:space="0" w:color="FFFFFF"/>
+              <w:left w:val="none" w:sz="0" w:space="0" w:color="FFFFFF"/>
+              <w:bottom w:val="none" w:sz="0" w:space="0" w:color="FFFFFF"/>
+              <w:right w:val="none" w:sz="0" w:space="0" w:color="FFFFFF"/>
+            </w:tcBorders>
+            <w:tcMar>
+              <w:top w:w="30" w:type="dxa"/>
+              <w:left w:w="0" w:type="dxa"/>
+              <w:bottom w:w="30" w:type="dxa"/>
+              <w:right w:w="120" w:type="dxa"/>
+            </w:tcMar>
+          </w:tcPr>
+          <w:p>
+            <w:pPr>
+              <w:spacing w:line="236" w:lineRule="auto"/>
+              <w:jc w:val="center"/>
+            </w:pPr>
+            <w:r>
+              <w:rPr>
+                <w:sz w:val="20"/>
+                <w:szCs w:val="20"/>
+              </w:rPr>
+              <w:t>2,100</w:t>
+            </w:r>
+          </w:p>
+        </w:tc>
+        <w:tc>
+          <w:tcPr>
+            <w:tcW w:w="1500" w:type="dxa"/>
+            <w:tcBorders>
+              <w:top w:val="none" w:sz="0" w:space="0" w:color="FFFFFF"/>
+              <w:left w:val="none" w:sz="0" w:space="0" w:color="FFFFFF"/>
+              <w:bottom w:val="none" w:sz="0" w:space="0" w:color="FFFFFF"/>
+              <w:right w:val="none" w:sz="0" w:space="0" w:color="FFFFFF"/>
+            </w:tcBorders>
+            <w:tcMar>
+              <w:top w:w="30" w:type="dxa"/>
+              <w:left w:w="0" w:type="dxa"/>
+              <w:bottom w:w="30" w:type="dxa"/>
+              <w:right w:w="120" w:type="dxa"/>
+            </w:tcMar>
+          </w:tcPr>
+          <w:p>
+            <w:pPr>
+              <w:spacing w:line="236" w:lineRule="auto"/>
+              <w:jc w:val="center"/>
+            </w:pPr>
+            <w:r>
+              <w:rPr>
+                <w:sz w:val="20"/>
+                <w:szCs w:val="20"/>
+              </w:rPr>
+              <w:t>450</w:t>
+            </w:r>
+          </w:p>
+        </w:tc>
+        <w:tc>
+          <w:tcPr>
+            <w:tcW w:w="1500" w:type="dxa"/>
+            <w:tcBorders>
+              <w:top w:val="none" w:sz="0" w:space="0" w:color="FFFFFF"/>
+              <w:left w:val="none" w:sz="0" w:space="0" w:color="FFFFFF"/>
+              <w:bottom w:val="none" w:sz="0" w:space="0" w:color="FFFFFF"/>
+              <w:right w:val="none" w:sz="0" w:space="0" w:color="FFFFFF"/>
+            </w:tcBorders>
+            <w:tcMar>
+              <w:top w:w="30" w:type="dxa"/>
+              <w:left w:w="0" w:type="dxa"/>
+              <w:bottom w:w="30" w:type="dxa"/>
+              <w:right w:w="120" w:type="dxa"/>
+            </w:tcMar>
+          </w:tcPr>
+          <w:p>
+            <w:pPr>
+              <w:spacing w:line="236" w:lineRule="auto"/>
+              <w:jc w:val="center"/>
+            </w:pPr>
+            <w:r>
+              <w:rPr>
+                <w:sz w:val="20"/>
+                <w:szCs w:val="20"/>
+              </w:rPr>
+              <w:t>450</w:t>
+            </w:r>
+          </w:p>
+        </w:tc>
+        <w:tc>
+          <w:tcPr>
+            <w:tcW w:w="1500" w:type="dxa"/>
+            <w:tcBorders>
+              <w:top w:val="none" w:sz="0" w:space="0" w:color="FFFFFF"/>
+              <w:left w:val="none" w:sz="0" w:space="0" w:color="FFFFFF"/>
+              <w:bottom w:val="none" w:sz="0" w:space="0" w:color="FFFFFF"/>
+              <w:right w:val="none" w:sz="0" w:space="0" w:color="FFFFFF"/>
+            </w:tcBorders>
+            <w:tcMar>
+              <w:top w:w="30" w:type="dxa"/>
+              <w:left w:w="0" w:type="dxa"/>
+              <w:bottom w:w="30" w:type="dxa"/>
+              <w:right w:w="120" w:type="dxa"/>
+            </w:tcMar>
+          </w:tcPr>
+          <w:p>
+            <w:pPr>
+              <w:spacing w:line="236" w:lineRule="auto"/>
+              <w:jc w:val="center"/>
+            </w:pPr>
+            <w:r>
+              <w:rPr>
+                <w:sz w:val="20"/>
+                <w:szCs w:val="20"/>
+              </w:rPr>
+              <w:t>3,000</w:t>
+            </w:r>
+          </w:p>
+        </w:tc>
+      </w:tr>
+      <w:tr>
+        <w:tblPrEx>
+          <w:tblCellMar>
+            <w:top w:w="0" w:type="dxa"/>
+            <w:bottom w:w="0" w:type="dxa"/>
+          </w:tblCellMar>
+        </w:tblPrEx>
+        <w:trPr>
+          <w:cantSplit/>
+          <w:jc w:val="center"/>
+        </w:trPr>
+        <w:tc>
+          <w:tcPr>
+            <w:tcW w:w="2200" w:type="dxa"/>
+            <w:tcBorders>
+              <w:top w:val="none" w:sz="0" w:space="0" w:color="FFFFFF"/>
+              <w:left w:val="none" w:sz="0" w:space="0" w:color="FFFFFF"/>
+              <w:bottom w:val="single" w:sz="4" w:space="0" w:color="000000"/>
+              <w:right w:val="none" w:sz="0" w:space="0" w:color="FFFFFF"/>
+            </w:tcBorders>
+            <w:tcMar>
+              <w:top w:w="30" w:type="dxa"/>
+              <w:left w:w="0" w:type="dxa"/>
+              <w:bottom w:w="30" w:type="dxa"/>
+              <w:right w:w="120" w:type="dxa"/>
+            </w:tcMar>
+          </w:tcPr>
+          <w:p>
+            <w:pPr>
+              <w:spacing w:line="236" w:lineRule="auto"/>
+            </w:pPr>
+            <w:r>
+              <w:rPr>
+                <w:b/>
+                <w:bCs/>
+                <w:sz w:val="20"/>
+                <w:szCs w:val="20"/>
+              </w:rPr>
+              <w:t>Total</w:t>
+            </w:r>
+          </w:p>
+        </w:tc>
+        <w:tc>
+          <w:tcPr>
+            <w:tcW w:w="1500" w:type="dxa"/>
+            <w:tcBorders>
+              <w:top w:val="none" w:sz="0" w:space="0" w:color="FFFFFF"/>
+              <w:left w:val="none" w:sz="0" w:space="0" w:color="FFFFFF"/>
+              <w:bottom w:val="single" w:sz="4" w:space="0" w:color="000000"/>
+              <w:right w:val="none" w:sz="0" w:space="0" w:color="FFFFFF"/>
+            </w:tcBorders>
+            <w:tcMar>
+              <w:top w:w="30" w:type="dxa"/>
+              <w:left w:w="0" w:type="dxa"/>
+              <w:bottom w:w="30" w:type="dxa"/>
+              <w:right w:w="120" w:type="dxa"/>
+            </w:tcMar>
+          </w:tcPr>
+          <w:p>
+            <w:pPr>
+              <w:spacing w:line="236" w:lineRule="auto"/>
+              <w:jc w:val="center"/>
+            </w:pPr>
+            <w:r>
+              <w:rPr>
+                <w:b/>
+                <w:bCs/>
+                <w:sz w:val="20"/>
+                <w:szCs w:val="20"/>
+              </w:rPr>
+              <w:t>18,900</w:t>
+            </w:r>
+          </w:p>
+        </w:tc>
+        <w:tc>
+          <w:tcPr>
+            <w:tcW w:w="1500" w:type="dxa"/>
+            <w:tcBorders>
+              <w:top w:val="none" w:sz="0" w:space="0" w:color="FFFFFF"/>
+              <w:left w:val="none" w:sz="0" w:space="0" w:color="FFFFFF"/>
+              <w:bottom w:val="single" w:sz="4" w:space="0" w:color="000000"/>
+              <w:right w:val="none" w:sz="0" w:space="0" w:color="FFFFFF"/>
+            </w:tcBorders>
+            <w:tcMar>
+              <w:top w:w="30" w:type="dxa"/>
+              <w:left w:w="0" w:type="dxa"/>
+              <w:bottom w:w="30" w:type="dxa"/>
+              <w:right w:w="120" w:type="dxa"/>
+            </w:tcMar>
+          </w:tcPr>
+          <w:p>
+            <w:pPr>
+              <w:spacing w:line="236" w:lineRule="auto"/>
+              <w:jc w:val="center"/>
+            </w:pPr>
+            <w:r>
+              <w:rPr>
+                <w:b/>
+                <w:bCs/>
+                <w:sz w:val="20"/>
+                <w:szCs w:val="20"/>
+              </w:rPr>
+              <w:t>4,050</w:t>
+            </w:r>
+          </w:p>
+        </w:tc>
+        <w:tc>
+          <w:tcPr>
+            <w:tcW w:w="1500" w:type="dxa"/>
+            <w:tcBorders>
+              <w:top w:val="none" w:sz="0" w:space="0" w:color="FFFFFF"/>
+              <w:left w:val="none" w:sz="0" w:space="0" w:color="FFFFFF"/>
+              <w:bottom w:val="single" w:sz="4" w:space="0" w:color="000000"/>
+              <w:right w:val="none" w:sz="0" w:space="0" w:color="FFFFFF"/>
+            </w:tcBorders>
+            <w:tcMar>
+              <w:top w:w="30" w:type="dxa"/>
+              <w:left w:w="0" w:type="dxa"/>
+              <w:bottom w:w="30" w:type="dxa"/>
+              <w:right w:w="120" w:type="dxa"/>
+            </w:tcMar>
+          </w:tcPr>
+          <w:p>
+            <w:pPr>
+              <w:spacing w:line="236" w:lineRule="auto"/>
+              <w:jc w:val="center"/>
+            </w:pPr>
+            <w:r>
+              <w:rPr>
+                <w:b/>
+                <w:bCs/>
+                <w:sz w:val="20"/>
+                <w:szCs w:val="20"/>
+              </w:rPr>
+              <w:t>4,050</w:t>
+            </w:r>
+          </w:p>
+        </w:tc>
+        <w:tc>
+          <w:tcPr>
+            <w:tcW w:w="1500" w:type="dxa"/>
+            <w:tcBorders>
+              <w:top w:val="none" w:sz="0" w:space="0" w:color="FFFFFF"/>
+              <w:left w:val="none" w:sz="0" w:space="0" w:color="FFFFFF"/>
+              <w:bottom w:val="single" w:sz="4" w:space="0" w:color="000000"/>
+              <w:right w:val="none" w:sz="0" w:space="0" w:color="FFFFFF"/>
+            </w:tcBorders>
+            <w:tcMar>
+              <w:top w:w="30" w:type="dxa"/>
+              <w:left w:w="0" w:type="dxa"/>
+              <w:bottom w:w="30" w:type="dxa"/>
+              <w:right w:w="120" w:type="dxa"/>
+            </w:tcMar>
+          </w:tcPr>
+          <w:p>
+            <w:pPr>
+              <w:spacing w:line="236" w:lineRule="auto"/>
+              <w:jc w:val="center"/>
+            </w:pPr>
+            <w:r>
+              <w:rPr>
+                <w:b/>
+                <w:bCs/>
+                <w:sz w:val="20"/>
+                <w:szCs w:val="20"/>
+              </w:rPr>
+              <w:t>27,000</w:t>
+            </w:r>
+          </w:p>
+        </w:tc>
+      </w:tr>
+    </w:tbl>
+    <w:p>
+      <w:pPr>
+        <w:spacing w:before="60" w:after="120" w:line="236" w:lineRule="auto"/>
+        <w:jc w:val="both"/>
+      </w:pPr>
+      <w:r>
+        <w:rPr>
+          <w:i/>
+          <w:iCs/>
+          <w:sz w:val="20"/>
+          <w:szCs w:val="20"/>
+        </w:rPr>
+        <w:t>Table 3. Per-class breakdown of the stratified train/validation/test split, confirming the exact 70%/15%/15% proportion is preserved within every class.</w:t>
+      </w:r>
+    </w:p>
+    <w:p>
+      <w:pPr>
         <w:pStyle w:val="Heading1"/>
-        <w:spacing w:before="320" w:after="150"/>
+        <w:spacing w:before="220" w:after="110"/>
         <w:jc w:val="both"/>
       </w:pPr>
       <w:r>
@@ -2081,7 +4002,7 @@
     </w:p>
     <w:p>
       <w:pPr>
-        <w:spacing w:after="170" w:line="276" w:lineRule="auto"/>
+        <w:spacing w:after="120" w:line="236" w:lineRule="auto"/>
         <w:ind w:left="340" w:hanging="340"/>
         <w:jc w:val="both"/>
       </w:pPr>
@@ -2098,7 +4019,7 @@
     </w:p>
     <w:p>
       <w:pPr>
-        <w:spacing w:after="170" w:line="276" w:lineRule="auto"/>
+        <w:spacing w:after="120" w:line="236" w:lineRule="auto"/>
         <w:jc w:val="both"/>
       </w:pPr>
       <w:r>
@@ -2108,7 +4029,7 @@
     <w:p>
       <w:pPr>
         <w:pStyle w:val="Heading1"/>
-        <w:spacing w:before="200" w:after="150"/>
+        <w:spacing w:before="150" w:after="110"/>
         <w:jc w:val="both"/>
       </w:pPr>
       <w:r>
@@ -2124,7 +4045,7 @@
     </w:p>
     <w:p>
       <w:pPr>
-        <w:spacing w:after="170" w:line="276" w:lineRule="auto"/>
+        <w:spacing w:after="120" w:line="236" w:lineRule="auto"/>
         <w:jc w:val="both"/>
       </w:pPr>
       <w:r>
@@ -2133,7 +4054,7 @@
     </w:p>
     <w:sectPr>
       <w:pgSz w:w="12240" w:h="15840"/>
-      <w:pgMar w:top="1440" w:right="1620" w:bottom="1440" w:left="1620" w:header="708" w:footer="708" w:gutter="0"/>
+      <w:pgMar w:top="1080" w:right="1620" w:bottom="1080" w:left="1620" w:header="708" w:footer="708" w:gutter="0"/>
       <w:cols w:space="720"/>
       <w:docGrid w:linePitch="360"/>
     </w:sectPr>

</xml_diff>